<commit_message>
wired up ssrf guard
</commit_message>
<xml_diff>
--- a/scalability issues.docx
+++ b/scalability issues.docx
@@ -439,144 +439,24 @@
           <w:ilvl w:val="0"/>
           <w:numId w:val="4"/>
         </w:numPr>
-      </w:pPr>
-      <w:r>
-        <w:t xml:space="preserve">At real scale this needs partitioning (e.g. by </w:t>
-      </w:r>
-      <w:proofErr w:type="spellStart"/>
-      <w:r>
-        <w:t>created_at</w:t>
-      </w:r>
-      <w:proofErr w:type="spellEnd"/>
-      <w:r>
-        <w:t xml:space="preserve"> month, or a hot/cold split) or a retention/archival job — right now there's no cap.</w:t>
-      </w:r>
-    </w:p>
-    <w:p>
-      <w:pPr>
         <w:rPr>
           <w:b/>
           <w:bCs/>
         </w:rPr>
       </w:pPr>
       <w:r>
-        <w:rPr>
-          <w:b/>
-          <w:bCs/>
-        </w:rPr>
-        <w:t>5. Retry reconciliation sweep — full-scan-shaped query</w:t>
-      </w:r>
-    </w:p>
-    <w:p>
-      <w:pPr>
-        <w:numPr>
-          <w:ilvl w:val="0"/>
-          <w:numId w:val="5"/>
-        </w:numPr>
-      </w:pPr>
+        <w:t xml:space="preserve">At real scale this needs partitioning (e.g. by </w:t>
+      </w:r>
       <w:proofErr w:type="spellStart"/>
-      <w:proofErr w:type="gramStart"/>
-      <w:r>
-        <w:t>runReconciliationSweep</w:t>
+      <w:r>
+        <w:t>created_at</w:t>
       </w:r>
       <w:proofErr w:type="spellEnd"/>
       <w:r>
-        <w:t>(</w:t>
-      </w:r>
-      <w:proofErr w:type="gramEnd"/>
-      <w:r>
-        <w:t xml:space="preserve">) in retry/retry.js does SELECT * FROM </w:t>
-      </w:r>
-      <w:proofErr w:type="spellStart"/>
-      <w:r>
-        <w:t>http_jobs</w:t>
-      </w:r>
-      <w:proofErr w:type="spellEnd"/>
-      <w:r>
-        <w:t xml:space="preserve"> WHERE enabled AND </w:t>
-      </w:r>
-      <w:proofErr w:type="spellStart"/>
-      <w:r>
-        <w:t>schedule_type</w:t>
-      </w:r>
-      <w:proofErr w:type="spellEnd"/>
-      <w:r>
-        <w:t xml:space="preserve">='ONCE' AND </w:t>
-      </w:r>
-      <w:proofErr w:type="spellStart"/>
-      <w:r>
-        <w:t>next_run</w:t>
-      </w:r>
-      <w:proofErr w:type="spellEnd"/>
-      <w:r>
-        <w:t xml:space="preserve"> IS NULL AND attempts &gt; 0 AND attempts &lt; </w:t>
-      </w:r>
-      <w:proofErr w:type="spellStart"/>
-      <w:r>
-        <w:t>max_attempts</w:t>
-      </w:r>
-      <w:proofErr w:type="spellEnd"/>
-      <w:r>
-        <w:t xml:space="preserve"> AND </w:t>
-      </w:r>
-      <w:proofErr w:type="spellStart"/>
-      <w:r>
-        <w:t>updated_at</w:t>
-      </w:r>
-      <w:proofErr w:type="spellEnd"/>
-      <w:r>
-        <w:t xml:space="preserve"> &lt; </w:t>
-      </w:r>
-      <w:proofErr w:type="gramStart"/>
-      <w:r>
-        <w:t>now(</w:t>
-      </w:r>
-      <w:proofErr w:type="gramEnd"/>
-      <w:r>
-        <w:t>) - interval '1 minute'.</w:t>
-      </w:r>
-    </w:p>
-    <w:p>
-      <w:pPr>
-        <w:numPr>
-          <w:ilvl w:val="0"/>
-          <w:numId w:val="5"/>
-        </w:numPr>
-      </w:pPr>
-      <w:r>
-        <w:t xml:space="preserve">There's no index covering this combination (enabled + </w:t>
-      </w:r>
-      <w:proofErr w:type="spellStart"/>
-      <w:r>
-        <w:t>schedule_type</w:t>
-      </w:r>
-      <w:proofErr w:type="spellEnd"/>
-      <w:r>
-        <w:t xml:space="preserve"> + </w:t>
-      </w:r>
-      <w:proofErr w:type="spellStart"/>
-      <w:r>
-        <w:t>next_run</w:t>
-      </w:r>
-      <w:proofErr w:type="spellEnd"/>
-      <w:r>
-        <w:t xml:space="preserve"> IS NULL + attempts compare). As </w:t>
-      </w:r>
-      <w:proofErr w:type="spellStart"/>
-      <w:r>
-        <w:t>http_jobs</w:t>
-      </w:r>
-      <w:proofErr w:type="spellEnd"/>
-      <w:r>
-        <w:t xml:space="preserve"> grows, this becomes a progressively more expensive sequential-</w:t>
-      </w:r>
-      <w:proofErr w:type="spellStart"/>
-      <w:r>
-        <w:t>ish</w:t>
-      </w:r>
-      <w:proofErr w:type="spellEnd"/>
-      <w:r>
-        <w:t xml:space="preserve"> scan every 30 seconds, competing for I/O with the scheduler's claim query and the outbox sweep, which also run continuously.</w:t>
+        <w:t xml:space="preserve"> month, or a hot/cold split) or a retention/archival job — right now there's no cap.</w:t>
+      </w:r>
+      <w:r>
+        <w:t xml:space="preserve"> </w:t>
       </w:r>
     </w:p>
     <w:p>
@@ -750,134 +630,13 @@
           <w:ilvl w:val="0"/>
           <w:numId w:val="7"/>
         </w:numPr>
-      </w:pPr>
-      <w:r>
-        <w:t>HEARTBEAT_SET_KEY (a ZSET) and PROCESSING_INDEX_KEY (a HASH) both grow with the number of concurrently in-flight executions — bounded by worker concurrency today (which is 1 per process, see #2), but if you fix #2 and add real concurrency, these structures grow proportionally and every heartbeat write/read scales with it.</w:t>
-      </w:r>
-    </w:p>
-    <w:p>
-      <w:pPr>
-        <w:numPr>
-          <w:ilvl w:val="0"/>
-          <w:numId w:val="7"/>
-        </w:numPr>
-      </w:pPr>
-      <w:r>
-        <w:t xml:space="preserve">The </w:t>
-      </w:r>
-      <w:r>
         <w:rPr>
           <w:b/>
           <w:bCs/>
         </w:rPr>
-        <w:t>cold-path SCAN fallback</w:t>
-      </w:r>
-      <w:r>
-        <w:t xml:space="preserve"> in recovery.js (</w:t>
-      </w:r>
-      <w:proofErr w:type="spellStart"/>
-      <w:r>
-        <w:t>findInProcessingListsFallback</w:t>
-      </w:r>
-      <w:proofErr w:type="spellEnd"/>
-      <w:r>
-        <w:t xml:space="preserve">) is explicitly flagged in your own comment as "rare, so the SCAN cost is acceptable" — that's true today with one job per worker process, but if #2 changes and you have many more </w:t>
-      </w:r>
-      <w:proofErr w:type="gramStart"/>
-      <w:r>
-        <w:t>processing:*</w:t>
-      </w:r>
-      <w:proofErr w:type="gramEnd"/>
-      <w:r>
-        <w:t xml:space="preserve"> keys or longer per-key lists, this fallback (triggered on any BLMOVE→HSET </w:t>
-      </w:r>
-      <w:r>
-        <w:lastRenderedPageBreak/>
-        <w:t xml:space="preserve">crash window) gets proportionally more expensive, and </w:t>
-      </w:r>
-      <w:proofErr w:type="gramStart"/>
-      <w:r>
-        <w:t>it's</w:t>
-      </w:r>
-      <w:proofErr w:type="gramEnd"/>
-      <w:r>
-        <w:t xml:space="preserve"> </w:t>
-      </w:r>
-      <w:proofErr w:type="gramStart"/>
-      <w:r>
-        <w:t>O(</w:t>
-      </w:r>
-      <w:proofErr w:type="gramEnd"/>
-      <w:r>
-        <w:t>all processing lists) in the worst case.</w:t>
-      </w:r>
-    </w:p>
-    <w:p>
-      <w:pPr>
-        <w:numPr>
-          <w:ilvl w:val="0"/>
-          <w:numId w:val="7"/>
-        </w:numPr>
-      </w:pPr>
-      <w:proofErr w:type="spellStart"/>
-      <w:r>
-        <w:t>recoverExecution</w:t>
-      </w:r>
-      <w:proofErr w:type="spellEnd"/>
-      <w:r>
-        <w:t xml:space="preserve"> takes a </w:t>
-      </w:r>
-      <w:r>
-        <w:rPr>
-          <w:b/>
-          <w:bCs/>
-        </w:rPr>
-        <w:t>per-execution Redis lock</w:t>
-      </w:r>
-      <w:r>
-        <w:t xml:space="preserve"> with a 15s TTL and processes stale executions </w:t>
-      </w:r>
-      <w:r>
-        <w:rPr>
-          <w:b/>
-          <w:bCs/>
-        </w:rPr>
-        <w:t>one at a time in a for loop</w:t>
-      </w:r>
-      <w:r>
-        <w:t xml:space="preserve"> (</w:t>
-      </w:r>
-      <w:proofErr w:type="spellStart"/>
-      <w:r>
-        <w:t>runRecoveryCycle</w:t>
-      </w:r>
-      <w:proofErr w:type="spellEnd"/>
-      <w:r>
-        <w:t xml:space="preserve">) — no concurrency, no batching. If a large batch of workers dies simultaneously (e.g. a bad deploy), recovery works through them serially, each with </w:t>
-      </w:r>
-      <w:proofErr w:type="spellStart"/>
-      <w:r>
-        <w:t>zscore</w:t>
-      </w:r>
-      <w:proofErr w:type="spellEnd"/>
-      <w:r>
-        <w:t xml:space="preserve"> + </w:t>
-      </w:r>
-      <w:proofErr w:type="spellStart"/>
-      <w:r>
-        <w:t>hget</w:t>
-      </w:r>
-      <w:proofErr w:type="spellEnd"/>
-      <w:r>
-        <w:t xml:space="preserve"> + </w:t>
-      </w:r>
-      <w:proofErr w:type="spellStart"/>
-      <w:r>
-        <w:t>getExecutionById</w:t>
-      </w:r>
-      <w:proofErr w:type="spellEnd"/>
-      <w:r>
-        <w:t xml:space="preserve"> + a full transaction — this could take a while to drain a large stale set, during which those jobs are neither running nor retried.</w:t>
+      </w:pPr>
+      <w:r>
+        <w:t>HEARTBEAT_SET_KEY (a ZSET) and PROCESSING_INDEX_KEY (a HASH) both grow with the number of concurrently in-flight executions — bounded by worker concurrency today (which is 1 per process, see #2), but if you fix #2 and add real concurrency, these structures grow proportionally and every heartbeat write/read scales with it.</w:t>
       </w:r>
     </w:p>
     <w:p>
@@ -928,120 +687,6 @@
       <w:proofErr w:type="spellEnd"/>
       <w:r>
         <w:t>-adjacent paths and worker job hydration, or it becomes a new external dependency and per-job latency source on your hot execution path.</w:t>
-      </w:r>
-    </w:p>
-    <w:p>
-      <w:pPr>
-        <w:rPr>
-          <w:b/>
-          <w:bCs/>
-        </w:rPr>
-      </w:pPr>
-      <w:r>
-        <w:rPr>
-          <w:b/>
-          <w:bCs/>
-        </w:rPr>
-        <w:t>Summary — rough priority order if you're optimizing for scale</w:t>
-      </w:r>
-    </w:p>
-    <w:p>
-      <w:pPr>
-        <w:numPr>
-          <w:ilvl w:val="0"/>
-          <w:numId w:val="9"/>
-        </w:numPr>
-      </w:pPr>
-      <w:r>
-        <w:rPr>
-          <w:b/>
-          <w:bCs/>
-        </w:rPr>
-        <w:t>Worker concurrency</w:t>
-      </w:r>
-      <w:r>
-        <w:t xml:space="preserve"> (#2) — biggest lever, currently the hardest throughput ceiling relative to how cheap the fix is.</w:t>
-      </w:r>
-    </w:p>
-    <w:p>
-      <w:pPr>
-        <w:numPr>
-          <w:ilvl w:val="0"/>
-          <w:numId w:val="9"/>
-        </w:numPr>
-      </w:pPr>
-      <w:proofErr w:type="spellStart"/>
-      <w:r>
-        <w:rPr>
-          <w:b/>
-          <w:bCs/>
-        </w:rPr>
-        <w:t>job_executions</w:t>
-      </w:r>
-      <w:proofErr w:type="spellEnd"/>
-      <w:r>
-        <w:rPr>
-          <w:b/>
-          <w:bCs/>
-        </w:rPr>
-        <w:t xml:space="preserve"> growth / partitioning or retention</w:t>
-      </w:r>
-      <w:r>
-        <w:t xml:space="preserve"> (#4) — the one that silently degrades everything (scheduler, retry sweep, history queries) as the system ages, not just under load spikes.</w:t>
-      </w:r>
-    </w:p>
-    <w:p>
-      <w:pPr>
-        <w:numPr>
-          <w:ilvl w:val="0"/>
-          <w:numId w:val="9"/>
-        </w:numPr>
-      </w:pPr>
-      <w:r>
-        <w:rPr>
-          <w:b/>
-          <w:bCs/>
-        </w:rPr>
-        <w:t>Retry sweep index</w:t>
-      </w:r>
-      <w:r>
-        <w:t xml:space="preserve"> (#5) — cheap to fix, currently the least-covered hot query.</w:t>
-      </w:r>
-    </w:p>
-    <w:p>
-      <w:pPr>
-        <w:numPr>
-          <w:ilvl w:val="0"/>
-          <w:numId w:val="9"/>
-        </w:numPr>
-      </w:pPr>
-      <w:r>
-        <w:rPr>
-          <w:b/>
-          <w:bCs/>
-        </w:rPr>
-        <w:t>Redis single-instance risk</w:t>
-      </w:r>
-      <w:r>
-        <w:t xml:space="preserve"> (#7) — matters most once you actually have failover/HA requirements, less urgent purely for throughput.</w:t>
-      </w:r>
-    </w:p>
-    <w:p>
-      <w:pPr>
-        <w:numPr>
-          <w:ilvl w:val="0"/>
-          <w:numId w:val="9"/>
-        </w:numPr>
-      </w:pPr>
-      <w:r>
-        <w:rPr>
-          <w:b/>
-          <w:bCs/>
-        </w:rPr>
-        <w:t>Scheduler batch size / dynamic polling</w:t>
-      </w:r>
-      <w:r>
-        <w:t xml:space="preserve"> (#1) — matters once job volume genuinely exceeds 10/sec sustained.</w:t>
       </w:r>
     </w:p>
     <w:sectPr>

</xml_diff>

<commit_message>
feat(retry): enhance failure classification with new status values and update handling logic
</commit_message>
<xml_diff>
--- a/scalability issues.docx
+++ b/scalability issues.docx
@@ -14,151 +14,6 @@
           <w:b/>
           <w:bCs/>
         </w:rPr>
-        <w:t>1. Scheduler — single-writer polling ceiling</w:t>
-      </w:r>
-    </w:p>
-    <w:p>
-      <w:pPr>
-        <w:numPr>
-          <w:ilvl w:val="0"/>
-          <w:numId w:val="1"/>
-        </w:numPr>
-      </w:pPr>
-      <w:r>
-        <w:rPr>
-          <w:b/>
-          <w:bCs/>
-        </w:rPr>
-        <w:t>Fixed 10s tick, single query, LIMIT 100</w:t>
-      </w:r>
-      <w:r>
-        <w:t xml:space="preserve"> (scheduler/index.js, </w:t>
-      </w:r>
-      <w:proofErr w:type="spellStart"/>
-      <w:r>
-        <w:t>claimDueJobs</w:t>
-      </w:r>
-      <w:proofErr w:type="spellEnd"/>
-      <w:r>
-        <w:t xml:space="preserve">). Throughput is capped at 100 jobs claimed per 10s = </w:t>
-      </w:r>
-      <w:r>
-        <w:rPr>
-          <w:b/>
-          <w:bCs/>
-        </w:rPr>
-        <w:t>10 jobs/sec</w:t>
-      </w:r>
-      <w:r>
-        <w:t>, no matter how much capacity your workers have. If due-job backlog exceeds that, jobs get progressively later — the scheduler has no way to catch up faster, it just claims another 100 on the next tick.</w:t>
-      </w:r>
-    </w:p>
-    <w:p>
-      <w:pPr>
-        <w:numPr>
-          <w:ilvl w:val="0"/>
-          <w:numId w:val="1"/>
-        </w:numPr>
-      </w:pPr>
-      <w:r>
-        <w:rPr>
-          <w:b/>
-          <w:bCs/>
-        </w:rPr>
-        <w:t>Only one scheduler process makes sense today, but nothing enforces that.</w:t>
-      </w:r>
-      <w:r>
-        <w:t xml:space="preserve"> FOR UPDATE SKIP LOCKED makes concurrent scheduler instances </w:t>
-      </w:r>
-      <w:r>
-        <w:rPr>
-          <w:i/>
-          <w:iCs/>
-        </w:rPr>
-        <w:t>safe</w:t>
-      </w:r>
-      <w:r>
-        <w:t>, but running two doesn't increase throughput proportionally — they'll mostly contend on the same due-job window and split the same 100-row batches, not double them. If you need more claim throughput you have to raise LIMIT, not add replicas.</w:t>
-      </w:r>
-    </w:p>
-    <w:p>
-      <w:pPr>
-        <w:numPr>
-          <w:ilvl w:val="0"/>
-          <w:numId w:val="1"/>
-        </w:numPr>
-      </w:pPr>
-      <w:r>
-        <w:rPr>
-          <w:b/>
-          <w:bCs/>
-        </w:rPr>
-        <w:t>The whole batch's per-job work is serialized inside one transaction</w:t>
-      </w:r>
-      <w:r>
-        <w:t xml:space="preserve"> (</w:t>
-      </w:r>
-      <w:proofErr w:type="spellStart"/>
-      <w:r>
-        <w:t>savepoint</w:t>
-      </w:r>
-      <w:proofErr w:type="spellEnd"/>
-      <w:r>
-        <w:t xml:space="preserve"> loop). 100 jobs × (INSERT execution + UPDATE job + INSERT outbox) all happen sequentially on one connection before COMMIT. As batch size grows this transaction gets longer, holding row locks (FOR UPDATE SKIP LOCKED claim) open longer, which increases contention with the </w:t>
-      </w:r>
-      <w:r>
-        <w:rPr>
-          <w:i/>
-          <w:iCs/>
-        </w:rPr>
-        <w:t>next</w:t>
-      </w:r>
-      <w:r>
-        <w:t xml:space="preserve"> tick's claim query and with anything else touching </w:t>
-      </w:r>
-      <w:proofErr w:type="spellStart"/>
-      <w:r>
-        <w:t>http_jobs</w:t>
-      </w:r>
-      <w:proofErr w:type="spellEnd"/>
-      <w:r>
-        <w:t>.</w:t>
-      </w:r>
-    </w:p>
-    <w:p>
-      <w:pPr>
-        <w:numPr>
-          <w:ilvl w:val="0"/>
-          <w:numId w:val="1"/>
-        </w:numPr>
-        <w:rPr>
-          <w:b/>
-          <w:bCs/>
-        </w:rPr>
-      </w:pPr>
-      <w:r>
-        <w:rPr>
-          <w:b/>
-          <w:bCs/>
-        </w:rPr>
-        <w:t>Poll interval is static regardless of load.</w:t>
-      </w:r>
-      <w:r>
-        <w:t xml:space="preserve"> Under light load, 10s adds up to 10s of unnecessary scheduling latency for every job. Under heavy load, it's too infrequent to drain backlog. There's no backpressure signal (e.g. "last batch was full, poll again immediately").</w:t>
-      </w:r>
-    </w:p>
-    <w:p>
-      <w:pPr>
-        <w:rPr>
-          <w:b/>
-          <w:bCs/>
-        </w:rPr>
-      </w:pPr>
-      <w:r>
-        <w:rPr>
-          <w:b/>
-          <w:bCs/>
-        </w:rPr>
         <w:t>3. Postgres connection usage</w:t>
       </w:r>
     </w:p>
@@ -410,11 +265,7 @@
       </w:r>
       <w:proofErr w:type="gramEnd"/>
       <w:r>
-        <w:t xml:space="preserve"> 4 </w:t>
-      </w:r>
-      <w:r>
-        <w:lastRenderedPageBreak/>
-        <w:t xml:space="preserve">indexes plus the outbox foreign key). </w:t>
+        <w:t xml:space="preserve"> 4 indexes plus the outbox foreign key). </w:t>
       </w:r>
       <w:proofErr w:type="spellStart"/>
       <w:r>
@@ -471,127 +322,6 @@
           <w:b/>
           <w:bCs/>
         </w:rPr>
-        <w:t>6. Outbox relay (the thing we just added) — its own new cost</w:t>
-      </w:r>
-    </w:p>
-    <w:p>
-      <w:r>
-        <w:t xml:space="preserve">Worth being honest about the </w:t>
-      </w:r>
-      <w:proofErr w:type="spellStart"/>
-      <w:r>
-        <w:t>tradeoff</w:t>
-      </w:r>
-      <w:proofErr w:type="spellEnd"/>
-      <w:r>
-        <w:t xml:space="preserve"> we just introduced:</w:t>
-      </w:r>
-    </w:p>
-    <w:p>
-      <w:pPr>
-        <w:numPr>
-          <w:ilvl w:val="0"/>
-          <w:numId w:val="6"/>
-        </w:numPr>
-      </w:pPr>
-      <w:r>
-        <w:t xml:space="preserve">Every scheduled execution now does </w:t>
-      </w:r>
-      <w:r>
-        <w:rPr>
-          <w:b/>
-          <w:bCs/>
-        </w:rPr>
-        <w:t>1 extra INSERT</w:t>
-      </w:r>
-      <w:r>
-        <w:t xml:space="preserve"> (outbox row) inside the scheduling transaction, plus </w:t>
-      </w:r>
-      <w:r>
-        <w:rPr>
-          <w:b/>
-          <w:bCs/>
-        </w:rPr>
-        <w:t>1 extra UPDATE</w:t>
-      </w:r>
-      <w:r>
-        <w:t xml:space="preserve"> (mark published) either from the fast path or the 5s sweep. At high scheduling volume this roughly doubles write amplification on top of what </w:t>
-      </w:r>
-      <w:proofErr w:type="spellStart"/>
-      <w:r>
-        <w:t>job_executions</w:t>
-      </w:r>
-      <w:proofErr w:type="spellEnd"/>
-      <w:r>
-        <w:t>/</w:t>
-      </w:r>
-      <w:proofErr w:type="spellStart"/>
-      <w:r>
-        <w:t>http_jobs</w:t>
-      </w:r>
-      <w:proofErr w:type="spellEnd"/>
-      <w:r>
-        <w:t xml:space="preserve"> already do.</w:t>
-      </w:r>
-    </w:p>
-    <w:p>
-      <w:pPr>
-        <w:numPr>
-          <w:ilvl w:val="0"/>
-          <w:numId w:val="6"/>
-        </w:numPr>
-      </w:pPr>
-      <w:r>
-        <w:t xml:space="preserve">The relay's claim query (FOR UPDATE SKIP LOCKED ... ORDER BY </w:t>
-      </w:r>
-      <w:proofErr w:type="spellStart"/>
-      <w:r>
-        <w:t>created_at</w:t>
-      </w:r>
-      <w:proofErr w:type="spellEnd"/>
-      <w:r>
-        <w:t>) is fine at moderate volume thanks to the partial index, but if Redis has an extended outage, unpublished rows accumulate and every 5s sweep does more work — there's no backoff or batching limit tuning based on backlog size beyond the flat limit=100.</w:t>
-      </w:r>
-    </w:p>
-    <w:p>
-      <w:pPr>
-        <w:numPr>
-          <w:ilvl w:val="0"/>
-          <w:numId w:val="6"/>
-        </w:numPr>
-      </w:pPr>
-      <w:r>
-        <w:t xml:space="preserve">If you ever want the outbox relay horizontally scaled (multiple </w:t>
-      </w:r>
-      <w:proofErr w:type="spellStart"/>
-      <w:r>
-        <w:t>outbox_process</w:t>
-      </w:r>
-      <w:proofErr w:type="spellEnd"/>
-      <w:r>
-        <w:t xml:space="preserve"> instances), the row-lock-based </w:t>
-      </w:r>
-      <w:proofErr w:type="spellStart"/>
-      <w:r>
-        <w:t>dedup</w:t>
-      </w:r>
-      <w:proofErr w:type="spellEnd"/>
-      <w:r>
-        <w:t xml:space="preserve"> works, but each instance still hits the same hot index — fine at your current scale, worth revisiting if execution volume grows an order of magnitude.</w:t>
-      </w:r>
-    </w:p>
-    <w:p>
-      <w:pPr>
-        <w:rPr>
-          <w:b/>
-          <w:bCs/>
-        </w:rPr>
-      </w:pPr>
-      <w:r>
-        <w:rPr>
-          <w:b/>
-          <w:bCs/>
-        </w:rPr>
         <w:t>7. Redis — single-instance dependency, several structures growing unboundedly</w:t>
       </w:r>
     </w:p>
@@ -670,7 +400,11 @@
       </w:r>
       <w:proofErr w:type="spellEnd"/>
       <w:r>
-        <w:t xml:space="preserve"> envelope encryption (KMS-backed) lands as discussed, every job read/write that touches </w:t>
+        <w:t xml:space="preserve"> envelope encryption (KMS-backed) lands as discussed, every </w:t>
+      </w:r>
+      <w:r>
+        <w:lastRenderedPageBreak/>
+        <w:t xml:space="preserve">job read/write that touches </w:t>
       </w:r>
       <w:proofErr w:type="spellStart"/>
       <w:r>

</xml_diff>

<commit_message>
feat(recovery): enhance execution status recording with final flag for better state management
</commit_message>
<xml_diff>
--- a/scalability issues.docx
+++ b/scalability issues.docx
@@ -24,47 +24,8 @@
           <w:numId w:val="3"/>
         </w:numPr>
       </w:pPr>
-      <w:proofErr w:type="spellStart"/>
-      <w:proofErr w:type="gramStart"/>
       <w:r>
-        <w:t>pool.connect</w:t>
-      </w:r>
-      <w:proofErr w:type="spellEnd"/>
-      <w:proofErr w:type="gramEnd"/>
-      <w:r>
-        <w:t>() is called per-transaction all over (</w:t>
-      </w:r>
-      <w:proofErr w:type="spellStart"/>
-      <w:r>
-        <w:t>handleExecution</w:t>
-      </w:r>
-      <w:proofErr w:type="spellEnd"/>
-      <w:r>
-        <w:t xml:space="preserve">, </w:t>
-      </w:r>
-      <w:proofErr w:type="spellStart"/>
-      <w:r>
-        <w:t>recoverExecution</w:t>
-      </w:r>
-      <w:proofErr w:type="spellEnd"/>
-      <w:r>
-        <w:t xml:space="preserve">, scheduler, outbox relay). With more workers, more recovery cycles, more outbox sweeps, more retry intake — each acquires its own short-lived connection from the pool. At scale this multiplies fast: </w:t>
-      </w:r>
-      <w:proofErr w:type="spellStart"/>
-      <w:r>
-        <w:t>num_workers</w:t>
-      </w:r>
-      <w:proofErr w:type="spellEnd"/>
-      <w:r>
-        <w:t xml:space="preserve"> × </w:t>
-      </w:r>
-      <w:proofErr w:type="spellStart"/>
-      <w:r>
-        <w:t>concurrent_executions_per_worker</w:t>
-      </w:r>
-      <w:proofErr w:type="spellEnd"/>
-      <w:r>
-        <w:t xml:space="preserve"> connections needed simultaneously once you add worker concurrency (see #2), on top of scheduler/retry/outbox/API pools.</w:t>
+        <w:t>pool.connect() is called per-transaction all over (handleExecution, recoverExecution, scheduler, outbox relay). With more workers, more recovery cycles, more outbox sweeps, more retry intake — each acquires its own short-lived connection from the pool. At scale this multiplies fast: num_workers × concurrent_executions_per_worker connections needed simultaneously once you add worker concurrency (see #2), on top of scheduler/retry/outbox/API pools.</w:t>
       </w:r>
     </w:p>
     <w:p>
@@ -79,42 +40,10 @@
           <w:b/>
           <w:bCs/>
         </w:rPr>
-        <w:t xml:space="preserve">No visible pool size tuning or </w:t>
-      </w:r>
-      <w:proofErr w:type="spellStart"/>
-      <w:r>
-        <w:rPr>
-          <w:b/>
-          <w:bCs/>
-        </w:rPr>
-        <w:t>PgBouncer</w:t>
-      </w:r>
-      <w:proofErr w:type="spellEnd"/>
-      <w:r>
-        <w:rPr>
-          <w:b/>
-          <w:bCs/>
-        </w:rPr>
-        <w:t>-style pooling layer</w:t>
+        <w:t>No visible pool size tuning or PgBouncer-style pooling layer</w:t>
       </w:r>
       <w:r>
-        <w:t xml:space="preserve"> mentioned in the codebase context — worth checking config/</w:t>
-      </w:r>
-      <w:proofErr w:type="spellStart"/>
-      <w:r>
-        <w:t>db.js's</w:t>
-      </w:r>
-      <w:proofErr w:type="spellEnd"/>
-      <w:r>
-        <w:t xml:space="preserve"> pool config against actual concurrent connection needs as workers scale horizontally. Postgres has a hard </w:t>
-      </w:r>
-      <w:proofErr w:type="spellStart"/>
-      <w:r>
-        <w:t>max_connections</w:t>
-      </w:r>
-      <w:proofErr w:type="spellEnd"/>
-      <w:r>
-        <w:t xml:space="preserve"> ceiling (default 100); every process type here (API, scheduler, N workers, recovery, retry, outbox) opens its own pool, so this adds up faster than it looks.</w:t>
+        <w:t xml:space="preserve"> mentioned in the codebase context — worth checking config/db.js's pool config against actual concurrent connection needs as workers scale horizontally. Postgres has a hard max_connections ceiling (default 100); every process type here (API, scheduler, N workers, recovery, retry, outbox) opens its own pool, so this adds up faster than it looks.</w:t>
       </w:r>
     </w:p>
     <w:p>
@@ -124,13 +53,8 @@
           <w:numId w:val="3"/>
         </w:numPr>
       </w:pPr>
-      <w:proofErr w:type="spellStart"/>
       <w:r>
-        <w:t>getExecutionHistory</w:t>
-      </w:r>
-      <w:proofErr w:type="spellEnd"/>
-      <w:r>
-        <w:t xml:space="preserve"> runs </w:t>
+        <w:t xml:space="preserve">getExecutionHistory runs </w:t>
       </w:r>
       <w:r>
         <w:rPr>
@@ -140,171 +64,7 @@
         <w:t>two separate queries</w:t>
       </w:r>
       <w:r>
-        <w:t xml:space="preserve"> (SELECT ... then SELECT </w:t>
-      </w:r>
-      <w:proofErr w:type="gramStart"/>
-      <w:r>
-        <w:t>COUNT(</w:t>
-      </w:r>
-      <w:proofErr w:type="gramEnd"/>
-      <w:r>
-        <w:t xml:space="preserve">*)) instead of a windowed single query — doubles round trips for every history page fetch, and </w:t>
-      </w:r>
-      <w:proofErr w:type="gramStart"/>
-      <w:r>
-        <w:t>COUNT(</w:t>
-      </w:r>
-      <w:proofErr w:type="gramEnd"/>
-      <w:r>
-        <w:t xml:space="preserve">*) over a growing </w:t>
-      </w:r>
-      <w:proofErr w:type="spellStart"/>
-      <w:r>
-        <w:t>job_executions</w:t>
-      </w:r>
-      <w:proofErr w:type="spellEnd"/>
-      <w:r>
-        <w:t xml:space="preserve"> table gets more expensive as history accumulates (no time-bounding, no partial index for it).</w:t>
-      </w:r>
-    </w:p>
-    <w:p>
-      <w:pPr>
-        <w:rPr>
-          <w:b/>
-          <w:bCs/>
-        </w:rPr>
-      </w:pPr>
-      <w:r>
-        <w:rPr>
-          <w:b/>
-          <w:bCs/>
-        </w:rPr>
-        <w:t xml:space="preserve">4. Table growth — </w:t>
-      </w:r>
-      <w:proofErr w:type="spellStart"/>
-      <w:r>
-        <w:rPr>
-          <w:b/>
-          <w:bCs/>
-        </w:rPr>
-        <w:t>job_executions</w:t>
-      </w:r>
-      <w:proofErr w:type="spellEnd"/>
-      <w:r>
-        <w:rPr>
-          <w:b/>
-          <w:bCs/>
-        </w:rPr>
-        <w:t xml:space="preserve"> is unbounded</w:t>
-      </w:r>
-    </w:p>
-    <w:p>
-      <w:pPr>
-        <w:numPr>
-          <w:ilvl w:val="0"/>
-          <w:numId w:val="4"/>
-        </w:numPr>
-      </w:pPr>
-      <w:r>
-        <w:t xml:space="preserve">Every scheduled run (CRON jobs especially) inserts a permanent row into </w:t>
-      </w:r>
-      <w:proofErr w:type="spellStart"/>
-      <w:r>
-        <w:t>job_executions</w:t>
-      </w:r>
-      <w:proofErr w:type="spellEnd"/>
-      <w:r>
-        <w:t>, and nothing in the code purges or archives old executions. A job on a 1-minute CRON creates 1,440 rows/day forever.</w:t>
-      </w:r>
-    </w:p>
-    <w:p>
-      <w:pPr>
-        <w:numPr>
-          <w:ilvl w:val="0"/>
-          <w:numId w:val="4"/>
-        </w:numPr>
-      </w:pPr>
-      <w:r>
-        <w:t>Indexes (</w:t>
-      </w:r>
-      <w:proofErr w:type="spellStart"/>
-      <w:r>
-        <w:t>idx_job_executions_job</w:t>
-      </w:r>
-      <w:proofErr w:type="spellEnd"/>
-      <w:r>
-        <w:t xml:space="preserve">, </w:t>
-      </w:r>
-      <w:proofErr w:type="spellStart"/>
-      <w:r>
-        <w:t>idx_job_executions_status</w:t>
-      </w:r>
-      <w:proofErr w:type="spellEnd"/>
-      <w:r>
-        <w:t xml:space="preserve">, </w:t>
-      </w:r>
-      <w:proofErr w:type="spellStart"/>
-      <w:r>
-        <w:t>idx_job_executions_scheduled</w:t>
-      </w:r>
-      <w:proofErr w:type="spellEnd"/>
-      <w:r>
-        <w:t xml:space="preserve">, </w:t>
-      </w:r>
-      <w:proofErr w:type="spellStart"/>
-      <w:r>
-        <w:t>idx_job_executions_job_created</w:t>
-      </w:r>
-      <w:proofErr w:type="spellEnd"/>
-      <w:r>
-        <w:t xml:space="preserve">) all keep working correctly but get progressively larger and slower to maintain (every INSERT </w:t>
-      </w:r>
-      <w:proofErr w:type="gramStart"/>
-      <w:r>
-        <w:t>touches</w:t>
-      </w:r>
-      <w:proofErr w:type="gramEnd"/>
-      <w:r>
-        <w:t xml:space="preserve"> 4 indexes plus the outbox foreign key). </w:t>
-      </w:r>
-      <w:proofErr w:type="spellStart"/>
-      <w:r>
-        <w:t>execution_outbox</w:t>
-      </w:r>
-      <w:proofErr w:type="spellEnd"/>
-      <w:r>
-        <w:t xml:space="preserve"> has an ON DELETE CASCADE to </w:t>
-      </w:r>
-      <w:proofErr w:type="spellStart"/>
-      <w:r>
-        <w:t>job_executions</w:t>
-      </w:r>
-      <w:proofErr w:type="spellEnd"/>
-      <w:r>
-        <w:t>, so growth there compounds it.</w:t>
-      </w:r>
-    </w:p>
-    <w:p>
-      <w:pPr>
-        <w:numPr>
-          <w:ilvl w:val="0"/>
-          <w:numId w:val="4"/>
-        </w:numPr>
-        <w:rPr>
-          <w:b/>
-          <w:bCs/>
-        </w:rPr>
-      </w:pPr>
-      <w:r>
-        <w:t xml:space="preserve">At real scale this needs partitioning (e.g. by </w:t>
-      </w:r>
-      <w:proofErr w:type="spellStart"/>
-      <w:r>
-        <w:t>created_at</w:t>
-      </w:r>
-      <w:proofErr w:type="spellEnd"/>
-      <w:r>
-        <w:t xml:space="preserve"> month, or a hot/cold split) or a retention/archival job — right now there's no cap.</w:t>
+        <w:t xml:space="preserve"> (SELECT ... then SELECT COUNT(*)) instead of a windowed single query — doubles round trips for every history page fetch, and COUNT(*) over a growing job_executions table gets more expensive as history accumulates (no time-bounding, no partial index for it).</w:t>
       </w:r>
       <w:r>
         <w:t xml:space="preserve"> </w:t>
@@ -343,15 +103,7 @@
         <w:t>one Redis instance</w:t>
       </w:r>
       <w:r>
-        <w:t xml:space="preserve"> with no mention of clustering/sentinel. Redis becomes a single point of failure and a single throughput ceiling for the whole pipeline — every scheduler tick, every worker pop, every heartbeat (every 10s per in-flight execution), every retry, every outbox </w:t>
-      </w:r>
-      <w:proofErr w:type="gramStart"/>
-      <w:r>
-        <w:t>publish</w:t>
-      </w:r>
-      <w:proofErr w:type="gramEnd"/>
-      <w:r>
-        <w:t xml:space="preserve"> all hit the same instance.</w:t>
+        <w:t xml:space="preserve"> with no mention of clustering/sentinel. Redis becomes a single point of failure and a single throughput ceiling for the whole pipeline — every scheduler tick, every worker pop, every heartbeat (every 10s per in-flight execution), every retry, every outbox publish all hit the same instance.</w:t>
       </w:r>
     </w:p>
     <w:p>
@@ -392,35 +144,7 @@
         </w:numPr>
       </w:pPr>
       <w:r>
-        <w:t xml:space="preserve">argon2 password hashing and JWT verification are correctly CPU-bound-but-necessary costs, but if </w:t>
-      </w:r>
-      <w:proofErr w:type="spellStart"/>
-      <w:r>
-        <w:t>auth_config</w:t>
-      </w:r>
-      <w:proofErr w:type="spellEnd"/>
-      <w:r>
-        <w:t xml:space="preserve"> envelope encryption (KMS-backed) lands as discussed, every </w:t>
-      </w:r>
-      <w:r>
-        <w:lastRenderedPageBreak/>
-        <w:t xml:space="preserve">job read/write that touches </w:t>
-      </w:r>
-      <w:proofErr w:type="spellStart"/>
-      <w:r>
-        <w:t>auth_config</w:t>
-      </w:r>
-      <w:proofErr w:type="spellEnd"/>
-      <w:r>
-        <w:t xml:space="preserve"> adds a KMS round trip or at least a decrypt operation — worth confirming that's cached/batched rather than done per-row, especially in </w:t>
-      </w:r>
-      <w:proofErr w:type="spellStart"/>
-      <w:r>
-        <w:t>claimDueJobs</w:t>
-      </w:r>
-      <w:proofErr w:type="spellEnd"/>
-      <w:r>
-        <w:t>-adjacent paths and worker job hydration, or it becomes a new external dependency and per-job latency source on your hot execution path.</w:t>
+        <w:t>argon2 password hashing and JWT verification are correctly CPU-bound-but-necessary costs, but if auth_config envelope encryption (KMS-backed) lands as discussed, every job read/write that touches auth_config adds a KMS round trip or at least a decrypt operation — worth confirming that's cached/batched rather than done per-row, especially in claimDueJobs-adjacent paths and worker job hydration, or it becomes a new external dependency and per-job latency source on your hot execution path.</w:t>
       </w:r>
     </w:p>
     <w:sectPr>

</xml_diff>

<commit_message>
feat(cache): implement team context caching to reduce Postgres queries on dashboard requests
</commit_message>
<xml_diff>
--- a/scalability issues.docx
+++ b/scalability issues.docx
@@ -147,6 +147,154 @@
         <w:t>argon2 password hashing and JWT verification are correctly CPU-bound-but-necessary costs, but if auth_config envelope encryption (KMS-backed) lands as discussed, every job read/write that touches auth_config adds a KMS round trip or at least a decrypt operation — worth confirming that's cached/batched rather than done per-row, especially in claimDueJobs-adjacent paths and worker job hydration, or it becomes a new external dependency and per-job latency source on your hot execution path.</w:t>
       </w:r>
     </w:p>
+    <w:p>
+      <w:r>
+        <w:rPr>
+          <w:b/>
+          <w:bCs/>
+        </w:rPr>
+        <w:t>1. loadTeamContext hits Postgres twice on every single dashboard request, uncached.</w:t>
+      </w:r>
+      <w:r>
+        <w:br/>
+        <w:t xml:space="preserve">This runs on nearly every /teams/* route (jobs, api-keys, members, roles...). It does findMembership (a JOIN) then a </w:t>
+      </w:r>
+      <w:r>
+        <w:rPr>
+          <w:i/>
+          <w:iCs/>
+        </w:rPr>
+        <w:t>separate</w:t>
+      </w:r>
+      <w:r>
+        <w:t xml:space="preserve"> getPermissionsForRole query — two sequential round trips, back to back, with zero caching. Compare this to the API-key path, which you've already solved with a Redis cache + explicit invalidation. This is the most impactful fix available:</w:t>
+      </w:r>
+    </w:p>
+    <w:p>
+      <w:pPr>
+        <w:numPr>
+          <w:ilvl w:val="0"/>
+          <w:numId w:val="10"/>
+        </w:numPr>
+      </w:pPr>
+      <w:r>
+        <w:t>Merge into one query: join role_permissions directly in findMembership so you get membership + permissions in a single round trip (permissions as an array agg).</w:t>
+      </w:r>
+    </w:p>
+    <w:p>
+      <w:pPr>
+        <w:numPr>
+          <w:ilvl w:val="0"/>
+          <w:numId w:val="10"/>
+        </w:numPr>
+      </w:pPr>
+      <w:r>
+        <w:lastRenderedPageBreak/>
+        <w:t>Then cache (teamId, userId) → {roleId, roleName, permissions} in Redis with a short TTL (like apikey:prefix:*), invalidated explicitly on updateMemberRoleService, removeMemberService, and role-permission changes (createCustomRoleService/deleteCustomRoleService/role_permissions edits). This is the exact same pattern as apiKeyCache.js — you've already built the playbook, it just wasn't applied here.</w:t>
+      </w:r>
+    </w:p>
+    <w:p>
+      <w:r>
+        <w:rPr>
+          <w:b/>
+          <w:bCs/>
+        </w:rPr>
+        <w:t>2. listJobsForTeam's status filter uses a correlated subquery per row.</w:t>
+      </w:r>
+    </w:p>
+    <w:p>
+      <w:r>
+        <w:t>sql</w:t>
+      </w:r>
+    </w:p>
+    <w:p>
+      <w:r>
+        <w:t>(SELECT je.status FROM job_executions je WHERE je.job_id = http_jobs.job_id ORDER BY je.created_at DESC LIMIT 1) = ANY(...)</w:t>
+      </w:r>
+    </w:p>
+    <w:p>
+      <w:r>
+        <w:t>This re-executes a sorted subquery against job_executions for every http_jobs row in the candidate set, once for the page and again for the COUNT(*). As execution history grows (you're already partitioning by month, so you're clearly expecting scale), this gets slow — and it's easy to miss in testing with small data. Fix options, roughly in order of effort:</w:t>
+      </w:r>
+    </w:p>
+    <w:p>
+      <w:pPr>
+        <w:numPr>
+          <w:ilvl w:val="0"/>
+          <w:numId w:val="11"/>
+        </w:numPr>
+      </w:pPr>
+      <w:r>
+        <w:t>Cheapest: add an index on job_executions (job_id, created_at DESC) if you don't already have one, so the subquery is an index scan, not a sort.</w:t>
+      </w:r>
+    </w:p>
+    <w:p>
+      <w:pPr>
+        <w:numPr>
+          <w:ilvl w:val="0"/>
+          <w:numId w:val="11"/>
+        </w:numPr>
+      </w:pPr>
+      <w:r>
+        <w:t>Better: denormalize a last_execution_status column onto http_jobs, updated wherever completeExecution/completeExecutionsBatch write — you already do this kind of denormalization for next_run. Then the filter becomes a plain indexed WHERE.</w:t>
+      </w:r>
+    </w:p>
+    <w:p>
+      <w:r>
+        <w:rPr>
+          <w:b/>
+          <w:bCs/>
+        </w:rPr>
+        <w:t>3. Two round trips where one would do, in a couple of spots:</w:t>
+      </w:r>
+    </w:p>
+    <w:p>
+      <w:pPr>
+        <w:numPr>
+          <w:ilvl w:val="0"/>
+          <w:numId w:val="12"/>
+        </w:numPr>
+      </w:pPr>
+      <w:r>
+        <w:t>listJobsForTeam and getExecutionHistory both run the page query and the COUNT(*) as separate queries. Collapse into one using COUNT(*) OVER() and drop the second round trip.</w:t>
+      </w:r>
+    </w:p>
+    <w:p>
+      <w:pPr>
+        <w:numPr>
+          <w:ilvl w:val="0"/>
+          <w:numId w:val="12"/>
+        </w:numPr>
+      </w:pPr>
+      <w:r>
+        <w:t>getJobExecutionHistoryService calls findJobByIdForTeam (ownership check) then getExecutionHistory (2 queries itself) — 3 round trips total for one endpoint. You already know the fix pattern because getExecutionByIdForTeam does it correctly: join http_jobs in the execution query itself (JOIN http_jobs hj ON hj.job_id = je.job_id AND hj.team_id = $team) instead of a separate existence check first.</w:t>
+      </w:r>
+    </w:p>
+    <w:p>
+      <w:pPr>
+        <w:numPr>
+          <w:ilvl w:val="0"/>
+          <w:numId w:val="12"/>
+        </w:numPr>
+      </w:pPr>
+      <w:r>
+        <w:t>updateJobService reads the job, merges in memory for validation, then issues the UPDATE. This one's harder to collapse since you need the pre-merge state for the backfill_on_missed_run/schedule_type cross-field validation — I'd leave this as-is unless you want to move that validation into a CHECK-constraint-style CTE, which adds complexity for one saved round trip.</w:t>
+      </w:r>
+    </w:p>
+    <w:p>
+      <w:r>
+        <w:rPr>
+          <w:b/>
+          <w:bCs/>
+        </w:rPr>
+        <w:t>4. Offset pagination will degrade at scale.</w:t>
+      </w:r>
+      <w:r>
+        <w:br/>
+        <w:t>OFFSET on http_jobs/job_executions gets linearly slower as offset grows — fine for now given the 100-row cap keeps people from requesting page 10,000, but worth switching to keyset pagination (WHERE created_at &lt; $cursor ORDER BY created_at DESC LIMIT $n) if teams start accumulating tens of thousands of jobs/executions and people page deep.</w:t>
+      </w:r>
+    </w:p>
+    <w:p/>
     <w:sectPr>
       <w:pgSz w:w="11906" w:h="16838"/>
       <w:pgMar w:top="1440" w:right="1440" w:bottom="1440" w:left="1440" w:header="708" w:footer="708" w:gutter="0"/>
@@ -607,6 +755,155 @@
     </w:lvl>
   </w:abstractNum>
   <w:abstractNum w:abstractNumId="3" w15:restartNumberingAfterBreak="0">
+    <w:nsid w:val="115A6E75"/>
+    <w:multiLevelType w:val="multilevel"/>
+    <w:tmpl w:val="7E4495D6"/>
+    <w:lvl w:ilvl="0">
+      <w:start w:val="1"/>
+      <w:numFmt w:val="bullet"/>
+      <w:lvlText w:val=""/>
+      <w:lvlJc w:val="left"/>
+      <w:pPr>
+        <w:tabs>
+          <w:tab w:val="num" w:pos="720"/>
+        </w:tabs>
+        <w:ind w:left="720" w:hanging="360"/>
+      </w:pPr>
+      <w:rPr>
+        <w:rFonts w:ascii="Symbol" w:hAnsi="Symbol" w:hint="default"/>
+        <w:sz w:val="20"/>
+      </w:rPr>
+    </w:lvl>
+    <w:lvl w:ilvl="1" w:tentative="1">
+      <w:start w:val="1"/>
+      <w:numFmt w:val="bullet"/>
+      <w:lvlText w:val="o"/>
+      <w:lvlJc w:val="left"/>
+      <w:pPr>
+        <w:tabs>
+          <w:tab w:val="num" w:pos="1440"/>
+        </w:tabs>
+        <w:ind w:left="1440" w:hanging="360"/>
+      </w:pPr>
+      <w:rPr>
+        <w:rFonts w:ascii="Courier New" w:hAnsi="Courier New" w:hint="default"/>
+        <w:sz w:val="20"/>
+      </w:rPr>
+    </w:lvl>
+    <w:lvl w:ilvl="2" w:tentative="1">
+      <w:start w:val="1"/>
+      <w:numFmt w:val="bullet"/>
+      <w:lvlText w:val=""/>
+      <w:lvlJc w:val="left"/>
+      <w:pPr>
+        <w:tabs>
+          <w:tab w:val="num" w:pos="2160"/>
+        </w:tabs>
+        <w:ind w:left="2160" w:hanging="360"/>
+      </w:pPr>
+      <w:rPr>
+        <w:rFonts w:ascii="Wingdings" w:hAnsi="Wingdings" w:hint="default"/>
+        <w:sz w:val="20"/>
+      </w:rPr>
+    </w:lvl>
+    <w:lvl w:ilvl="3" w:tentative="1">
+      <w:start w:val="1"/>
+      <w:numFmt w:val="bullet"/>
+      <w:lvlText w:val=""/>
+      <w:lvlJc w:val="left"/>
+      <w:pPr>
+        <w:tabs>
+          <w:tab w:val="num" w:pos="2880"/>
+        </w:tabs>
+        <w:ind w:left="2880" w:hanging="360"/>
+      </w:pPr>
+      <w:rPr>
+        <w:rFonts w:ascii="Wingdings" w:hAnsi="Wingdings" w:hint="default"/>
+        <w:sz w:val="20"/>
+      </w:rPr>
+    </w:lvl>
+    <w:lvl w:ilvl="4" w:tentative="1">
+      <w:start w:val="1"/>
+      <w:numFmt w:val="bullet"/>
+      <w:lvlText w:val=""/>
+      <w:lvlJc w:val="left"/>
+      <w:pPr>
+        <w:tabs>
+          <w:tab w:val="num" w:pos="3600"/>
+        </w:tabs>
+        <w:ind w:left="3600" w:hanging="360"/>
+      </w:pPr>
+      <w:rPr>
+        <w:rFonts w:ascii="Wingdings" w:hAnsi="Wingdings" w:hint="default"/>
+        <w:sz w:val="20"/>
+      </w:rPr>
+    </w:lvl>
+    <w:lvl w:ilvl="5" w:tentative="1">
+      <w:start w:val="1"/>
+      <w:numFmt w:val="bullet"/>
+      <w:lvlText w:val=""/>
+      <w:lvlJc w:val="left"/>
+      <w:pPr>
+        <w:tabs>
+          <w:tab w:val="num" w:pos="4320"/>
+        </w:tabs>
+        <w:ind w:left="4320" w:hanging="360"/>
+      </w:pPr>
+      <w:rPr>
+        <w:rFonts w:ascii="Wingdings" w:hAnsi="Wingdings" w:hint="default"/>
+        <w:sz w:val="20"/>
+      </w:rPr>
+    </w:lvl>
+    <w:lvl w:ilvl="6" w:tentative="1">
+      <w:start w:val="1"/>
+      <w:numFmt w:val="bullet"/>
+      <w:lvlText w:val=""/>
+      <w:lvlJc w:val="left"/>
+      <w:pPr>
+        <w:tabs>
+          <w:tab w:val="num" w:pos="5040"/>
+        </w:tabs>
+        <w:ind w:left="5040" w:hanging="360"/>
+      </w:pPr>
+      <w:rPr>
+        <w:rFonts w:ascii="Wingdings" w:hAnsi="Wingdings" w:hint="default"/>
+        <w:sz w:val="20"/>
+      </w:rPr>
+    </w:lvl>
+    <w:lvl w:ilvl="7" w:tentative="1">
+      <w:start w:val="1"/>
+      <w:numFmt w:val="bullet"/>
+      <w:lvlText w:val=""/>
+      <w:lvlJc w:val="left"/>
+      <w:pPr>
+        <w:tabs>
+          <w:tab w:val="num" w:pos="5760"/>
+        </w:tabs>
+        <w:ind w:left="5760" w:hanging="360"/>
+      </w:pPr>
+      <w:rPr>
+        <w:rFonts w:ascii="Wingdings" w:hAnsi="Wingdings" w:hint="default"/>
+        <w:sz w:val="20"/>
+      </w:rPr>
+    </w:lvl>
+    <w:lvl w:ilvl="8" w:tentative="1">
+      <w:start w:val="1"/>
+      <w:numFmt w:val="bullet"/>
+      <w:lvlText w:val=""/>
+      <w:lvlJc w:val="left"/>
+      <w:pPr>
+        <w:tabs>
+          <w:tab w:val="num" w:pos="6480"/>
+        </w:tabs>
+        <w:ind w:left="6480" w:hanging="360"/>
+      </w:pPr>
+      <w:rPr>
+        <w:rFonts w:ascii="Wingdings" w:hAnsi="Wingdings" w:hint="default"/>
+        <w:sz w:val="20"/>
+      </w:rPr>
+    </w:lvl>
+  </w:abstractNum>
+  <w:abstractNum w:abstractNumId="4" w15:restartNumberingAfterBreak="0">
     <w:nsid w:val="11EA7263"/>
     <w:multiLevelType w:val="multilevel"/>
     <w:tmpl w:val="1A6E673C"/>
@@ -755,7 +1052,156 @@
       </w:rPr>
     </w:lvl>
   </w:abstractNum>
-  <w:abstractNum w:abstractNumId="4" w15:restartNumberingAfterBreak="0">
+  <w:abstractNum w:abstractNumId="5" w15:restartNumberingAfterBreak="0">
+    <w:nsid w:val="19DF44A2"/>
+    <w:multiLevelType w:val="multilevel"/>
+    <w:tmpl w:val="7AD81034"/>
+    <w:lvl w:ilvl="0">
+      <w:start w:val="1"/>
+      <w:numFmt w:val="bullet"/>
+      <w:lvlText w:val=""/>
+      <w:lvlJc w:val="left"/>
+      <w:pPr>
+        <w:tabs>
+          <w:tab w:val="num" w:pos="720"/>
+        </w:tabs>
+        <w:ind w:left="720" w:hanging="360"/>
+      </w:pPr>
+      <w:rPr>
+        <w:rFonts w:ascii="Symbol" w:hAnsi="Symbol" w:hint="default"/>
+        <w:sz w:val="20"/>
+      </w:rPr>
+    </w:lvl>
+    <w:lvl w:ilvl="1" w:tentative="1">
+      <w:start w:val="1"/>
+      <w:numFmt w:val="bullet"/>
+      <w:lvlText w:val="o"/>
+      <w:lvlJc w:val="left"/>
+      <w:pPr>
+        <w:tabs>
+          <w:tab w:val="num" w:pos="1440"/>
+        </w:tabs>
+        <w:ind w:left="1440" w:hanging="360"/>
+      </w:pPr>
+      <w:rPr>
+        <w:rFonts w:ascii="Courier New" w:hAnsi="Courier New" w:hint="default"/>
+        <w:sz w:val="20"/>
+      </w:rPr>
+    </w:lvl>
+    <w:lvl w:ilvl="2" w:tentative="1">
+      <w:start w:val="1"/>
+      <w:numFmt w:val="bullet"/>
+      <w:lvlText w:val=""/>
+      <w:lvlJc w:val="left"/>
+      <w:pPr>
+        <w:tabs>
+          <w:tab w:val="num" w:pos="2160"/>
+        </w:tabs>
+        <w:ind w:left="2160" w:hanging="360"/>
+      </w:pPr>
+      <w:rPr>
+        <w:rFonts w:ascii="Wingdings" w:hAnsi="Wingdings" w:hint="default"/>
+        <w:sz w:val="20"/>
+      </w:rPr>
+    </w:lvl>
+    <w:lvl w:ilvl="3" w:tentative="1">
+      <w:start w:val="1"/>
+      <w:numFmt w:val="bullet"/>
+      <w:lvlText w:val=""/>
+      <w:lvlJc w:val="left"/>
+      <w:pPr>
+        <w:tabs>
+          <w:tab w:val="num" w:pos="2880"/>
+        </w:tabs>
+        <w:ind w:left="2880" w:hanging="360"/>
+      </w:pPr>
+      <w:rPr>
+        <w:rFonts w:ascii="Wingdings" w:hAnsi="Wingdings" w:hint="default"/>
+        <w:sz w:val="20"/>
+      </w:rPr>
+    </w:lvl>
+    <w:lvl w:ilvl="4" w:tentative="1">
+      <w:start w:val="1"/>
+      <w:numFmt w:val="bullet"/>
+      <w:lvlText w:val=""/>
+      <w:lvlJc w:val="left"/>
+      <w:pPr>
+        <w:tabs>
+          <w:tab w:val="num" w:pos="3600"/>
+        </w:tabs>
+        <w:ind w:left="3600" w:hanging="360"/>
+      </w:pPr>
+      <w:rPr>
+        <w:rFonts w:ascii="Wingdings" w:hAnsi="Wingdings" w:hint="default"/>
+        <w:sz w:val="20"/>
+      </w:rPr>
+    </w:lvl>
+    <w:lvl w:ilvl="5" w:tentative="1">
+      <w:start w:val="1"/>
+      <w:numFmt w:val="bullet"/>
+      <w:lvlText w:val=""/>
+      <w:lvlJc w:val="left"/>
+      <w:pPr>
+        <w:tabs>
+          <w:tab w:val="num" w:pos="4320"/>
+        </w:tabs>
+        <w:ind w:left="4320" w:hanging="360"/>
+      </w:pPr>
+      <w:rPr>
+        <w:rFonts w:ascii="Wingdings" w:hAnsi="Wingdings" w:hint="default"/>
+        <w:sz w:val="20"/>
+      </w:rPr>
+    </w:lvl>
+    <w:lvl w:ilvl="6" w:tentative="1">
+      <w:start w:val="1"/>
+      <w:numFmt w:val="bullet"/>
+      <w:lvlText w:val=""/>
+      <w:lvlJc w:val="left"/>
+      <w:pPr>
+        <w:tabs>
+          <w:tab w:val="num" w:pos="5040"/>
+        </w:tabs>
+        <w:ind w:left="5040" w:hanging="360"/>
+      </w:pPr>
+      <w:rPr>
+        <w:rFonts w:ascii="Wingdings" w:hAnsi="Wingdings" w:hint="default"/>
+        <w:sz w:val="20"/>
+      </w:rPr>
+    </w:lvl>
+    <w:lvl w:ilvl="7" w:tentative="1">
+      <w:start w:val="1"/>
+      <w:numFmt w:val="bullet"/>
+      <w:lvlText w:val=""/>
+      <w:lvlJc w:val="left"/>
+      <w:pPr>
+        <w:tabs>
+          <w:tab w:val="num" w:pos="5760"/>
+        </w:tabs>
+        <w:ind w:left="5760" w:hanging="360"/>
+      </w:pPr>
+      <w:rPr>
+        <w:rFonts w:ascii="Wingdings" w:hAnsi="Wingdings" w:hint="default"/>
+        <w:sz w:val="20"/>
+      </w:rPr>
+    </w:lvl>
+    <w:lvl w:ilvl="8" w:tentative="1">
+      <w:start w:val="1"/>
+      <w:numFmt w:val="bullet"/>
+      <w:lvlText w:val=""/>
+      <w:lvlJc w:val="left"/>
+      <w:pPr>
+        <w:tabs>
+          <w:tab w:val="num" w:pos="6480"/>
+        </w:tabs>
+        <w:ind w:left="6480" w:hanging="360"/>
+      </w:pPr>
+      <w:rPr>
+        <w:rFonts w:ascii="Wingdings" w:hAnsi="Wingdings" w:hint="default"/>
+        <w:sz w:val="20"/>
+      </w:rPr>
+    </w:lvl>
+  </w:abstractNum>
+  <w:abstractNum w:abstractNumId="6" w15:restartNumberingAfterBreak="0">
     <w:nsid w:val="3C362CF2"/>
     <w:multiLevelType w:val="multilevel"/>
     <w:tmpl w:val="F0E64A92"/>
@@ -904,7 +1350,7 @@
       </w:rPr>
     </w:lvl>
   </w:abstractNum>
-  <w:abstractNum w:abstractNumId="5" w15:restartNumberingAfterBreak="0">
+  <w:abstractNum w:abstractNumId="7" w15:restartNumberingAfterBreak="0">
     <w:nsid w:val="40AC392C"/>
     <w:multiLevelType w:val="multilevel"/>
     <w:tmpl w:val="0CB86822"/>
@@ -1053,7 +1499,156 @@
       </w:rPr>
     </w:lvl>
   </w:abstractNum>
-  <w:abstractNum w:abstractNumId="6" w15:restartNumberingAfterBreak="0">
+  <w:abstractNum w:abstractNumId="8" w15:restartNumberingAfterBreak="0">
+    <w:nsid w:val="4C150519"/>
+    <w:multiLevelType w:val="multilevel"/>
+    <w:tmpl w:val="66287CB0"/>
+    <w:lvl w:ilvl="0">
+      <w:start w:val="1"/>
+      <w:numFmt w:val="bullet"/>
+      <w:lvlText w:val=""/>
+      <w:lvlJc w:val="left"/>
+      <w:pPr>
+        <w:tabs>
+          <w:tab w:val="num" w:pos="720"/>
+        </w:tabs>
+        <w:ind w:left="720" w:hanging="360"/>
+      </w:pPr>
+      <w:rPr>
+        <w:rFonts w:ascii="Symbol" w:hAnsi="Symbol" w:hint="default"/>
+        <w:sz w:val="20"/>
+      </w:rPr>
+    </w:lvl>
+    <w:lvl w:ilvl="1" w:tentative="1">
+      <w:start w:val="1"/>
+      <w:numFmt w:val="bullet"/>
+      <w:lvlText w:val="o"/>
+      <w:lvlJc w:val="left"/>
+      <w:pPr>
+        <w:tabs>
+          <w:tab w:val="num" w:pos="1440"/>
+        </w:tabs>
+        <w:ind w:left="1440" w:hanging="360"/>
+      </w:pPr>
+      <w:rPr>
+        <w:rFonts w:ascii="Courier New" w:hAnsi="Courier New" w:hint="default"/>
+        <w:sz w:val="20"/>
+      </w:rPr>
+    </w:lvl>
+    <w:lvl w:ilvl="2" w:tentative="1">
+      <w:start w:val="1"/>
+      <w:numFmt w:val="bullet"/>
+      <w:lvlText w:val=""/>
+      <w:lvlJc w:val="left"/>
+      <w:pPr>
+        <w:tabs>
+          <w:tab w:val="num" w:pos="2160"/>
+        </w:tabs>
+        <w:ind w:left="2160" w:hanging="360"/>
+      </w:pPr>
+      <w:rPr>
+        <w:rFonts w:ascii="Wingdings" w:hAnsi="Wingdings" w:hint="default"/>
+        <w:sz w:val="20"/>
+      </w:rPr>
+    </w:lvl>
+    <w:lvl w:ilvl="3" w:tentative="1">
+      <w:start w:val="1"/>
+      <w:numFmt w:val="bullet"/>
+      <w:lvlText w:val=""/>
+      <w:lvlJc w:val="left"/>
+      <w:pPr>
+        <w:tabs>
+          <w:tab w:val="num" w:pos="2880"/>
+        </w:tabs>
+        <w:ind w:left="2880" w:hanging="360"/>
+      </w:pPr>
+      <w:rPr>
+        <w:rFonts w:ascii="Wingdings" w:hAnsi="Wingdings" w:hint="default"/>
+        <w:sz w:val="20"/>
+      </w:rPr>
+    </w:lvl>
+    <w:lvl w:ilvl="4" w:tentative="1">
+      <w:start w:val="1"/>
+      <w:numFmt w:val="bullet"/>
+      <w:lvlText w:val=""/>
+      <w:lvlJc w:val="left"/>
+      <w:pPr>
+        <w:tabs>
+          <w:tab w:val="num" w:pos="3600"/>
+        </w:tabs>
+        <w:ind w:left="3600" w:hanging="360"/>
+      </w:pPr>
+      <w:rPr>
+        <w:rFonts w:ascii="Wingdings" w:hAnsi="Wingdings" w:hint="default"/>
+        <w:sz w:val="20"/>
+      </w:rPr>
+    </w:lvl>
+    <w:lvl w:ilvl="5" w:tentative="1">
+      <w:start w:val="1"/>
+      <w:numFmt w:val="bullet"/>
+      <w:lvlText w:val=""/>
+      <w:lvlJc w:val="left"/>
+      <w:pPr>
+        <w:tabs>
+          <w:tab w:val="num" w:pos="4320"/>
+        </w:tabs>
+        <w:ind w:left="4320" w:hanging="360"/>
+      </w:pPr>
+      <w:rPr>
+        <w:rFonts w:ascii="Wingdings" w:hAnsi="Wingdings" w:hint="default"/>
+        <w:sz w:val="20"/>
+      </w:rPr>
+    </w:lvl>
+    <w:lvl w:ilvl="6" w:tentative="1">
+      <w:start w:val="1"/>
+      <w:numFmt w:val="bullet"/>
+      <w:lvlText w:val=""/>
+      <w:lvlJc w:val="left"/>
+      <w:pPr>
+        <w:tabs>
+          <w:tab w:val="num" w:pos="5040"/>
+        </w:tabs>
+        <w:ind w:left="5040" w:hanging="360"/>
+      </w:pPr>
+      <w:rPr>
+        <w:rFonts w:ascii="Wingdings" w:hAnsi="Wingdings" w:hint="default"/>
+        <w:sz w:val="20"/>
+      </w:rPr>
+    </w:lvl>
+    <w:lvl w:ilvl="7" w:tentative="1">
+      <w:start w:val="1"/>
+      <w:numFmt w:val="bullet"/>
+      <w:lvlText w:val=""/>
+      <w:lvlJc w:val="left"/>
+      <w:pPr>
+        <w:tabs>
+          <w:tab w:val="num" w:pos="5760"/>
+        </w:tabs>
+        <w:ind w:left="5760" w:hanging="360"/>
+      </w:pPr>
+      <w:rPr>
+        <w:rFonts w:ascii="Wingdings" w:hAnsi="Wingdings" w:hint="default"/>
+        <w:sz w:val="20"/>
+      </w:rPr>
+    </w:lvl>
+    <w:lvl w:ilvl="8" w:tentative="1">
+      <w:start w:val="1"/>
+      <w:numFmt w:val="bullet"/>
+      <w:lvlText w:val=""/>
+      <w:lvlJc w:val="left"/>
+      <w:pPr>
+        <w:tabs>
+          <w:tab w:val="num" w:pos="6480"/>
+        </w:tabs>
+        <w:ind w:left="6480" w:hanging="360"/>
+      </w:pPr>
+      <w:rPr>
+        <w:rFonts w:ascii="Wingdings" w:hAnsi="Wingdings" w:hint="default"/>
+        <w:sz w:val="20"/>
+      </w:rPr>
+    </w:lvl>
+  </w:abstractNum>
+  <w:abstractNum w:abstractNumId="9" w15:restartNumberingAfterBreak="0">
     <w:nsid w:val="685012ED"/>
     <w:multiLevelType w:val="multilevel"/>
     <w:tmpl w:val="A6D27650"/>
@@ -1166,7 +1761,7 @@
       </w:pPr>
     </w:lvl>
   </w:abstractNum>
-  <w:abstractNum w:abstractNumId="7" w15:restartNumberingAfterBreak="0">
+  <w:abstractNum w:abstractNumId="10" w15:restartNumberingAfterBreak="0">
     <w:nsid w:val="6B1B4732"/>
     <w:multiLevelType w:val="multilevel"/>
     <w:tmpl w:val="20940E08"/>
@@ -1315,7 +1910,7 @@
       </w:rPr>
     </w:lvl>
   </w:abstractNum>
-  <w:abstractNum w:abstractNumId="8" w15:restartNumberingAfterBreak="0">
+  <w:abstractNum w:abstractNumId="11" w15:restartNumberingAfterBreak="0">
     <w:nsid w:val="6B9D343B"/>
     <w:multiLevelType w:val="multilevel"/>
     <w:tmpl w:val="DA76943E"/>
@@ -1465,22 +2060,22 @@
     </w:lvl>
   </w:abstractNum>
   <w:num w:numId="1" w16cid:durableId="1695419542">
-    <w:abstractNumId w:val="7"/>
+    <w:abstractNumId w:val="10"/>
   </w:num>
   <w:num w:numId="2" w16cid:durableId="14188350">
     <w:abstractNumId w:val="0"/>
   </w:num>
   <w:num w:numId="3" w16cid:durableId="569999037">
+    <w:abstractNumId w:val="6"/>
+  </w:num>
+  <w:num w:numId="4" w16cid:durableId="1427657436">
+    <w:abstractNumId w:val="11"/>
+  </w:num>
+  <w:num w:numId="5" w16cid:durableId="45377857">
     <w:abstractNumId w:val="4"/>
   </w:num>
-  <w:num w:numId="4" w16cid:durableId="1427657436">
-    <w:abstractNumId w:val="8"/>
-  </w:num>
-  <w:num w:numId="5" w16cid:durableId="45377857">
-    <w:abstractNumId w:val="3"/>
-  </w:num>
   <w:num w:numId="6" w16cid:durableId="799570265">
-    <w:abstractNumId w:val="5"/>
+    <w:abstractNumId w:val="7"/>
   </w:num>
   <w:num w:numId="7" w16cid:durableId="457725113">
     <w:abstractNumId w:val="2"/>
@@ -1489,7 +2084,16 @@
     <w:abstractNumId w:val="1"/>
   </w:num>
   <w:num w:numId="9" w16cid:durableId="836924921">
-    <w:abstractNumId w:val="6"/>
+    <w:abstractNumId w:val="9"/>
+  </w:num>
+  <w:num w:numId="10" w16cid:durableId="1475023666">
+    <w:abstractNumId w:val="3"/>
+  </w:num>
+  <w:num w:numId="11" w16cid:durableId="1853951178">
+    <w:abstractNumId w:val="5"/>
+  </w:num>
+  <w:num w:numId="12" w16cid:durableId="2087922737">
+    <w:abstractNumId w:val="8"/>
   </w:num>
 </w:numbering>
 </file>
@@ -2097,7 +2701,6 @@
   <w:style w:type="character" w:default="1" w:styleId="DefaultParagraphFont">
     <w:name w:val="Default Paragraph Font"/>
     <w:uiPriority w:val="1"/>
-    <w:semiHidden/>
     <w:unhideWhenUsed/>
   </w:style>
   <w:style w:type="table" w:default="1" w:styleId="TableNormal">

</xml_diff>